<commit_message>
Cartas ETC 88 con logo + primera carta a Induveca
- data/logo_etc.png: logo ICHTHYS (Pez · Caminos de Vida) traído del Drive;
  se incrusta en el membrete de todas las cartas
- Carta_Induveca_ETC88.docx: primera carta (reemplaza Grupo SID), fecha
  18-jun-2026, pedido de embutidos (salami/jamón/salchichón/mortadela) +
  aceite/harina de MercaSID; framing 'asociación de fieles'
- Firmas con teléfonos de la Co-Dirección (Juan Manuel 829-898-1416 ·
  Jean Carlo 849-850-5178), apellido completo 'de la Cruz Méndez'
- Regenerados modelos/directorio/donantes/tracker · verify.py TODO PASS

Co-Authored-By: Claude Opus 4.8 <noreply@anthropic.com>
Claude-Session: https://claude.ai/code/session_01MGAmtqoRwx6cYP4Ki2adap
</commit_message>
<xml_diff>
--- a/Carta_Modelo_Empresa_ETC88.docx
+++ b/Carta_Modelo_Empresa_ETC88.docx
@@ -49,13 +49,38 @@
         <w:jc w:val="center"/>
       </w:pPr>
       <w:r>
-        <w:rPr>
-          <w:b w:val="0"/>
-          <w:i w:val="0"/>
-          <w:color w:val="808080"/>
-          <w:sz w:val="18"/>
-        </w:rPr>
-        <w:t>[ logo ETC (ΙΧΘΥΣ) · insertar ]</w:t>
+        <w:drawing>
+          <wp:inline xmlns:a="http://schemas.openxmlformats.org/drawingml/2006/main" xmlns:pic="http://schemas.openxmlformats.org/drawingml/2006/picture">
+            <wp:extent cx="1371600" cy="743567"/>
+            <wp:docPr id="1" name="Picture 1"/>
+            <wp:cNvGraphicFramePr>
+              <a:graphicFrameLocks noChangeAspect="1"/>
+            </wp:cNvGraphicFramePr>
+            <a:graphic>
+              <a:graphicData uri="http://schemas.openxmlformats.org/drawingml/2006/picture">
+                <pic:pic>
+                  <pic:nvPicPr>
+                    <pic:cNvPr id="0" name="logo_etc.png"/>
+                    <pic:cNvPicPr/>
+                  </pic:nvPicPr>
+                  <pic:blipFill>
+                    <a:blip r:embed="rId9"/>
+                    <a:stretch>
+                      <a:fillRect/>
+                    </a:stretch>
+                  </pic:blipFill>
+                  <pic:spPr>
+                    <a:xfrm>
+                      <a:off x="0" y="0"/>
+                      <a:ext cx="1371600" cy="743567"/>
+                    </a:xfrm>
+                    <a:prstGeom prst="rect"/>
+                  </pic:spPr>
+                </pic:pic>
+              </a:graphicData>
+            </a:graphic>
+          </wp:inline>
+        </w:drawing>
       </w:r>
     </w:p>
     <w:p>
@@ -195,24 +220,88 @@
       </w:r>
     </w:p>
     <w:p/>
-    <w:p>
-      <w:r>
-        <w:rPr>
-          <w:b w:val="0"/>
-          <w:i w:val="0"/>
-        </w:rPr>
-        <w:t>____________________            ____________________</w:t>
-      </w:r>
-    </w:p>
-    <w:p>
-      <w:r>
-        <w:rPr>
-          <w:b/>
-          <w:i w:val="0"/>
-        </w:rPr>
-        <w:t>Juan Manuel de la Cruz Méndez            Jean Carlo de la Cruz Méndez</w:t>
-      </w:r>
-    </w:p>
+    <w:tbl>
+      <w:tblPr>
+        <w:tblW w:type="auto" w:w="0"/>
+        <w:tblLook w:firstColumn="1" w:firstRow="1" w:lastColumn="0" w:lastRow="0" w:noHBand="0" w:noVBand="1" w:val="04A0"/>
+      </w:tblPr>
+      <w:tblGrid>
+        <w:gridCol w:w="4320"/>
+        <w:gridCol w:w="4320"/>
+      </w:tblGrid>
+      <w:tr>
+        <w:tc>
+          <w:tcPr>
+            <w:tcW w:type="dxa" w:w="4320"/>
+          </w:tcPr>
+          <w:p>
+            <w:r>
+              <w:t>____________________</w:t>
+            </w:r>
+          </w:p>
+        </w:tc>
+        <w:tc>
+          <w:tcPr>
+            <w:tcW w:type="dxa" w:w="4320"/>
+          </w:tcPr>
+          <w:p>
+            <w:r>
+              <w:t>____________________</w:t>
+            </w:r>
+          </w:p>
+        </w:tc>
+      </w:tr>
+      <w:tr>
+        <w:tc>
+          <w:tcPr>
+            <w:tcW w:type="dxa" w:w="4320"/>
+          </w:tcPr>
+          <w:p>
+            <w:r>
+              <w:rPr>
+                <w:b/>
+              </w:rPr>
+              <w:t>Juan Manuel de la Cruz Méndez</w:t>
+            </w:r>
+          </w:p>
+        </w:tc>
+        <w:tc>
+          <w:tcPr>
+            <w:tcW w:type="dxa" w:w="4320"/>
+          </w:tcPr>
+          <w:p>
+            <w:r>
+              <w:rPr>
+                <w:b/>
+              </w:rPr>
+              <w:t>Jean Carlo de la Cruz Méndez</w:t>
+            </w:r>
+          </w:p>
+        </w:tc>
+      </w:tr>
+      <w:tr>
+        <w:tc>
+          <w:tcPr>
+            <w:tcW w:type="dxa" w:w="4320"/>
+          </w:tcPr>
+          <w:p>
+            <w:r>
+              <w:t>829-898-1416</w:t>
+            </w:r>
+          </w:p>
+        </w:tc>
+        <w:tc>
+          <w:tcPr>
+            <w:tcW w:type="dxa" w:w="4320"/>
+          </w:tcPr>
+          <w:p>
+            <w:r>
+              <w:t>849-850-5178</w:t>
+            </w:r>
+          </w:p>
+        </w:tc>
+      </w:tr>
+    </w:tbl>
     <w:p>
       <w:r>
         <w:rPr>
@@ -220,15 +309,6 @@
           <w:i w:val="0"/>
         </w:rPr>
         <w:t>Co-Dirección · Encuentro Total con Cristo (ETC) 88</w:t>
-      </w:r>
-    </w:p>
-    <w:p>
-      <w:r>
-        <w:rPr>
-          <w:b w:val="0"/>
-          <w:i/>
-        </w:rPr>
-        <w:t>[Tel. / WhatsApp de la Co-Dirección]</w:t>
       </w:r>
     </w:p>
     <w:p>
@@ -251,13 +331,38 @@
         <w:jc w:val="center"/>
       </w:pPr>
       <w:r>
-        <w:rPr>
-          <w:b w:val="0"/>
-          <w:i w:val="0"/>
-          <w:color w:val="808080"/>
-          <w:sz w:val="18"/>
-        </w:rPr>
-        <w:t>[ logo ETC (ΙΧΘΥΣ) · insertar ]</w:t>
+        <w:drawing>
+          <wp:inline xmlns:a="http://schemas.openxmlformats.org/drawingml/2006/main" xmlns:pic="http://schemas.openxmlformats.org/drawingml/2006/picture">
+            <wp:extent cx="1371600" cy="743567"/>
+            <wp:docPr id="2" name="Picture 2"/>
+            <wp:cNvGraphicFramePr>
+              <a:graphicFrameLocks noChangeAspect="1"/>
+            </wp:cNvGraphicFramePr>
+            <a:graphic>
+              <a:graphicData uri="http://schemas.openxmlformats.org/drawingml/2006/picture">
+                <pic:pic>
+                  <pic:nvPicPr>
+                    <pic:cNvPr id="0" name="logo_etc.png"/>
+                    <pic:cNvPicPr/>
+                  </pic:nvPicPr>
+                  <pic:blipFill>
+                    <a:blip r:embed="rId9"/>
+                    <a:stretch>
+                      <a:fillRect/>
+                    </a:stretch>
+                  </pic:blipFill>
+                  <pic:spPr>
+                    <a:xfrm>
+                      <a:off x="0" y="0"/>
+                      <a:ext cx="1371600" cy="743567"/>
+                    </a:xfrm>
+                    <a:prstGeom prst="rect"/>
+                  </pic:spPr>
+                </pic:pic>
+              </a:graphicData>
+            </a:graphic>
+          </wp:inline>
+        </w:drawing>
       </w:r>
     </w:p>
     <w:p>
@@ -581,24 +686,88 @@
       </w:r>
     </w:p>
     <w:p/>
-    <w:p>
-      <w:r>
-        <w:rPr>
-          <w:b w:val="0"/>
-          <w:i w:val="0"/>
-        </w:rPr>
-        <w:t>____________________            ____________________</w:t>
-      </w:r>
-    </w:p>
-    <w:p>
-      <w:r>
-        <w:rPr>
-          <w:b/>
-          <w:i w:val="0"/>
-        </w:rPr>
-        <w:t>Juan Manuel de la Cruz Méndez            Jean Carlo de la Cruz Méndez</w:t>
-      </w:r>
-    </w:p>
+    <w:tbl>
+      <w:tblPr>
+        <w:tblW w:type="auto" w:w="0"/>
+        <w:tblLook w:firstColumn="1" w:firstRow="1" w:lastColumn="0" w:lastRow="0" w:noHBand="0" w:noVBand="1" w:val="04A0"/>
+      </w:tblPr>
+      <w:tblGrid>
+        <w:gridCol w:w="4320"/>
+        <w:gridCol w:w="4320"/>
+      </w:tblGrid>
+      <w:tr>
+        <w:tc>
+          <w:tcPr>
+            <w:tcW w:type="dxa" w:w="4320"/>
+          </w:tcPr>
+          <w:p>
+            <w:r>
+              <w:t>____________________</w:t>
+            </w:r>
+          </w:p>
+        </w:tc>
+        <w:tc>
+          <w:tcPr>
+            <w:tcW w:type="dxa" w:w="4320"/>
+          </w:tcPr>
+          <w:p>
+            <w:r>
+              <w:t>____________________</w:t>
+            </w:r>
+          </w:p>
+        </w:tc>
+      </w:tr>
+      <w:tr>
+        <w:tc>
+          <w:tcPr>
+            <w:tcW w:type="dxa" w:w="4320"/>
+          </w:tcPr>
+          <w:p>
+            <w:r>
+              <w:rPr>
+                <w:b/>
+              </w:rPr>
+              <w:t>Juan Manuel de la Cruz Méndez</w:t>
+            </w:r>
+          </w:p>
+        </w:tc>
+        <w:tc>
+          <w:tcPr>
+            <w:tcW w:type="dxa" w:w="4320"/>
+          </w:tcPr>
+          <w:p>
+            <w:r>
+              <w:rPr>
+                <w:b/>
+              </w:rPr>
+              <w:t>Jean Carlo de la Cruz Méndez</w:t>
+            </w:r>
+          </w:p>
+        </w:tc>
+      </w:tr>
+      <w:tr>
+        <w:tc>
+          <w:tcPr>
+            <w:tcW w:type="dxa" w:w="4320"/>
+          </w:tcPr>
+          <w:p>
+            <w:r>
+              <w:t>829-898-1416</w:t>
+            </w:r>
+          </w:p>
+        </w:tc>
+        <w:tc>
+          <w:tcPr>
+            <w:tcW w:type="dxa" w:w="4320"/>
+          </w:tcPr>
+          <w:p>
+            <w:r>
+              <w:t>849-850-5178</w:t>
+            </w:r>
+          </w:p>
+        </w:tc>
+      </w:tr>
+    </w:tbl>
     <w:p>
       <w:r>
         <w:rPr>
@@ -606,15 +775,6 @@
           <w:i w:val="0"/>
         </w:rPr>
         <w:t>Co-Dirección · Encuentro Total con Cristo (ETC) 88</w:t>
-      </w:r>
-    </w:p>
-    <w:p>
-      <w:r>
-        <w:rPr>
-          <w:b w:val="0"/>
-          <w:i/>
-        </w:rPr>
-        <w:t>[Tel. / WhatsApp de la Co-Dirección]</w:t>
       </w:r>
     </w:p>
     <w:sectPr>

</xml_diff>